<commit_message>
Finalized Week 1 evaluation deliverables
</commit_message>
<xml_diff>
--- a/docs/W01_Dataset_Specification.docx
+++ b/docs/W01_Dataset_Specification.docx
@@ -3429,7 +3429,7 @@
         <w:rPr>
           <w:rFonts w:ascii="Times New Roman" w:hAnsi="Times New Roman" w:eastAsia="Songti SC" w:cs="Times New Roman"/>
         </w:rPr>
-        <w:t>review includes status (draft, needs_revision, approved), author_id, reviewer_ids, difficulty_rule, native_zh_author_id, native_zh_review_status, and notes. Contributor IDs describe confirmed activity and may remain null where identity is not established. All 35 Chinese records identify Jingwei Huang as the confirmed native author and have approved native language review. English records use null for native_zh_author_id and not_applicable for native_zh_review_status. A substantive Chinese passage in an English-primary case requires recorded Chinese language review too.</w:t>
+        <w:t>review includes status (draft, needs_revision, approved), author_id, reviewer_ids, difficulty_rule, native_zh_author_id, native_zh_review_status, and notes. Contributor IDs describe confirmed activity and may remain null where identity is not established. All 35 Chinese records identify me as the confirmed native author and have approved native language review. English records use null for native_zh_author_id and not_applicable for native_zh_review_status. A substantive Chinese passage in an English-primary case requires recorded Chinese language review too.</w:t>
       </w:r>
     </w:p>
     <w:p>
@@ -3605,7 +3605,7 @@
         <w:rPr>
           <w:rFonts w:ascii="Times New Roman" w:hAnsi="Times New Roman" w:eastAsia="Songti SC" w:cs="Times New Roman"/>
         </w:rPr>
-        <w:t>Review Chinese wording and cultural assumptions through Jingwei's native authorship/review. Record actual contributors and assistance. Resolve disagreements and mark approved only after the checks pass.</w:t>
+        <w:t>Review Chinese wording and cultural assumptions through my native authorship/review. Record actual contributors and assistance. Resolve disagreements and mark approved only after the checks pass.</w:t>
       </w:r>
     </w:p>
     <w:p>

</xml_diff>